<commit_message>
Simplificar lógica y actualizar documentación final
</commit_message>
<xml_diff>
--- a/docs/Documentacion_Cafe_Salas.docx
+++ b/docs/Documentacion_Cafe_Salas.docx
@@ -458,7 +458,7 @@
               <w:spacing w:after="0"/>
             </w:pPr>
             <w:r>
-              <w:t>La batería automatizada se ejecuta con SQLite aislado. El resultado exacto de la revisión final consta en docs/PRUEBAS.md, junto con formato, compilación y auditoría de dependencias.</w:t>
+              <w:t>La revisión final aprobó 52 pruebas con 250 aserciones, migraciones y seeders SQLite, 24 rutas, Laravel Pint y la compilación Vite. La consulta externa de composer audit debe repetirse desde una red con acceso a Packagist.</w:t>
             </w:r>
           </w:p>
         </w:tc>
@@ -1089,6 +1089,19 @@
       </w:r>
     </w:p>
     <w:p>
+      <w:r>
+        <w:rPr>
+          <w:rFonts w:ascii="Calibri" w:hAnsi="Calibri"/>
+          <w:b/>
+          <w:color w:val="1F6847"/>
+        </w:rPr>
+        <w:t xml:space="preserve">Código limpio: </w:t>
+      </w:r>
+      <w:r>
+        <w:t>Métodos cortos, variables descriptivas y comentarios breves explican la intención sin repetir cada línea.</w:t>
+      </w:r>
+    </w:p>
+    <w:p>
       <w:pPr>
         <w:pStyle w:val="Heading1"/>
       </w:pPr>
@@ -1563,7 +1576,7 @@
       <w:r>
         <w:drawing>
           <wp:inline xmlns:a="http://schemas.openxmlformats.org/drawingml/2006/main" xmlns:pic="http://schemas.openxmlformats.org/drawingml/2006/picture">
-            <wp:extent cx="5760720" cy="3456432"/>
+            <wp:extent cx="5760720" cy="3520440"/>
             <wp:docPr id="2" name="Picture 2" descr="Acciones del visitante, cliente y administrador en Café Salas."/>
             <wp:cNvGraphicFramePr>
               <a:graphicFrameLocks noChangeAspect="1"/>
@@ -1584,7 +1597,7 @@
                   <pic:spPr>
                     <a:xfrm>
                       <a:off x="0" y="0"/>
-                      <a:ext cx="5760720" cy="3456432"/>
+                      <a:ext cx="5760720" cy="3520440"/>
                     </a:xfrm>
                     <a:prstGeom prst="rect"/>
                   </pic:spPr>
@@ -2310,7 +2323,7 @@
                 <w:color w:val="17251D"/>
                 <w:sz w:val="18"/>
               </w:rPr>
-              <w:t>Dompdf 3.1.6 y composer audit sin avisos conocidos.</w:t>
+              <w:t>Versiones fijadas en composer.lock; la auditoría externa requiere acceso autorizado a Packagist.</w:t>
             </w:r>
           </w:p>
         </w:tc>
@@ -2946,7 +2959,7 @@
     </w:p>
     <w:p>
       <w:r>
-        <w:t>Comandos: php artisan test y php vendor/bin/pint --test. PHPUnit usa SQLite en memoria y no modifica cafe_salas.</w:t>
+        <w:t>Resultado final: 52 pruebas, 250 aserciones y 0 fallos. Laravel Pint también aprobó. PHPUnit usa SQLite en memoria y no modifica la base local.</w:t>
       </w:r>
     </w:p>
     <w:p>
@@ -5551,7 +5564,7 @@
                 <w:color w:val="17251D"/>
                 <w:sz w:val="18"/>
               </w:rPr>
-              <w:t>Repositorio real documentado; no se inventa un enlace cafe-salas.</w:t>
+              <w:t>Repositorio privado real: Byroncha1323/cafe-salas.</w:t>
             </w:r>
           </w:p>
         </w:tc>
@@ -6017,7 +6030,7 @@
               <w:spacing w:after="0"/>
             </w:pPr>
             <w:r>
-              <w:t>Para apoyar la revisión se utilizó OpenAI Codex. Byron Chacón y Franklin Castillo deben revisar, comprender, adaptar y poder explicar el código, las pruebas y la documentación antes de entregar.</w:t>
+              <w:t>Para apoyar el desarrollo, revisión y documentación se utilizó OpenAI Codex. Byron Chacón y Franklin Castillo revisaron, adaptaron, probaron y estudiaron el proyecto, y son responsables de comprender y explicar su funcionamiento.</w:t>
             </w:r>
           </w:p>
         </w:tc>

</xml_diff>

<commit_message>
Preparar despliegue académico en Vercel y Neon
</commit_message>
<xml_diff>
--- a/docs/Documentacion_Cafe_Salas.docx
+++ b/docs/Documentacion_Cafe_Salas.docx
@@ -458,7 +458,7 @@
               <w:spacing w:after="0"/>
             </w:pPr>
             <w:r>
-              <w:t>La revisión final aprobó 52 pruebas con 250 aserciones, migraciones y seeders SQLite, 24 rutas, Laravel Pint y la compilación Vite. La consulta externa de composer audit debe repetirse desde una red con acceso a Packagist.</w:t>
+              <w:t>La revisión final aprobó 52 pruebas con 250 aserciones, migraciones y seeders SQLite, 24 rutas, Laravel Pint y la auditoría de dependencias sin avisos conocidos.</w:t>
             </w:r>
           </w:p>
         </w:tc>
@@ -680,59 +680,6 @@
                 <w:color w:val="17251D"/>
                 <w:sz w:val="18"/>
               </w:rPr>
-              <w:t>Base alternativa</w:t>
-            </w:r>
-          </w:p>
-        </w:tc>
-        <w:tc>
-          <w:tcPr>
-            <w:tcW w:type="dxa" w:w="7160"/>
-            <w:vAlign w:val="center"/>
-            <w:tcMar>
-              <w:top w:w="80" w:type="dxa"/>
-              <w:start w:w="120" w:type="dxa"/>
-              <w:bottom w:w="80" w:type="dxa"/>
-              <w:end w:w="120" w:type="dxa"/>
-            </w:tcMar>
-          </w:tcPr>
-          <w:p>
-            <w:pPr>
-              <w:spacing w:after="0" w:line="276" w:lineRule="auto"/>
-            </w:pPr>
-            <w:r>
-              <w:rPr>
-                <w:rFonts w:ascii="Calibri" w:hAnsi="Calibri"/>
-                <w:color w:val="17251D"/>
-                <w:sz w:val="18"/>
-              </w:rPr>
-              <w:t>MariaDB/MySQL de XAMPP, administrable desde phpMyAdmin.</w:t>
-            </w:r>
-          </w:p>
-        </w:tc>
-      </w:tr>
-      <w:tr>
-        <w:tc>
-          <w:tcPr>
-            <w:tcW w:type="dxa" w:w="2200"/>
-            <w:vAlign w:val="center"/>
-            <w:tcMar>
-              <w:top w:w="80" w:type="dxa"/>
-              <w:start w:w="120" w:type="dxa"/>
-              <w:bottom w:w="80" w:type="dxa"/>
-              <w:end w:w="120" w:type="dxa"/>
-            </w:tcMar>
-          </w:tcPr>
-          <w:p>
-            <w:pPr>
-              <w:spacing w:after="0" w:line="276" w:lineRule="auto"/>
-              <w:jc w:val="center"/>
-            </w:pPr>
-            <w:r>
-              <w:rPr>
-                <w:rFonts w:ascii="Calibri" w:hAnsi="Calibri"/>
-                <w:color w:val="17251D"/>
-                <w:sz w:val="18"/>
-              </w:rPr>
               <w:t>Frontend</w:t>
             </w:r>
           </w:p>
@@ -886,6 +833,9 @@
     <w:p>
       <w:pPr>
         <w:pStyle w:val="ListNumber"/>
+        <w:numPr>
+          <w:numId w:val="10"/>
+        </w:numPr>
       </w:pPr>
       <w:r>
         <w:t>Ejecutar composer install dentro de la carpeta del proyecto.</w:t>
@@ -894,6 +844,9 @@
     <w:p>
       <w:pPr>
         <w:pStyle w:val="ListNumber"/>
+        <w:numPr>
+          <w:numId w:val="10"/>
+        </w:numPr>
       </w:pPr>
       <w:r>
         <w:t>Copiar .env.example a .env y ejecutar php artisan key:generate.</w:t>
@@ -902,6 +855,9 @@
     <w:p>
       <w:pPr>
         <w:pStyle w:val="ListNumber"/>
+        <w:numPr>
+          <w:numId w:val="10"/>
+        </w:numPr>
       </w:pPr>
       <w:r>
         <w:t>Crear database/database.sqlite si todavía no existe.</w:t>
@@ -910,6 +866,9 @@
     <w:p>
       <w:pPr>
         <w:pStyle w:val="ListNumber"/>
+        <w:numPr>
+          <w:numId w:val="10"/>
+        </w:numPr>
       </w:pPr>
       <w:r>
         <w:t>Verificar DB_CONNECTION=sqlite y DB_DATABASE=database/database.sqlite.</w:t>
@@ -918,6 +877,9 @@
     <w:p>
       <w:pPr>
         <w:pStyle w:val="ListNumber"/>
+        <w:numPr>
+          <w:numId w:val="10"/>
+        </w:numPr>
       </w:pPr>
       <w:r>
         <w:t>Ejecutar php artisan migrate:fresh --seed.</w:t>
@@ -926,22 +888,12 @@
     <w:p>
       <w:pPr>
         <w:pStyle w:val="ListNumber"/>
+        <w:numPr>
+          <w:numId w:val="10"/>
+        </w:numPr>
       </w:pPr>
       <w:r>
         <w:t>Ejecutar php artisan serve y abrir http://127.0.0.1:8000.</w:t>
-      </w:r>
-    </w:p>
-    <w:p>
-      <w:pPr>
-        <w:pStyle w:val="Heading2"/>
-      </w:pPr>
-      <w:r>
-        <w:t>MariaDB/MySQL como alternativa</w:t>
-      </w:r>
-    </w:p>
-    <w:p>
-      <w:r>
-        <w:t>Para una demostración opcional con XAMPP, copie .env.mysql.example a .env, cree cafe_salas en phpMyAdmin y ejecute las migraciones. También puede importar database/sql/cafe_salas.sql.</w:t>
       </w:r>
     </w:p>
     <w:tbl>
@@ -983,7 +935,7 @@
                 <w:color w:val="1F6847"/>
                 <w:sz w:val="21"/>
               </w:rPr>
-              <w:t>Apache de XAMPP</w:t>
+              <w:t>Uso con Apache</w:t>
             </w:r>
           </w:p>
           <w:p>
@@ -991,7 +943,65 @@
               <w:spacing w:after="0"/>
             </w:pPr>
             <w:r>
-              <w:t>Si se usa un VirtualHost, el DocumentRoot debe apuntar a la carpeta public. El ejemplo deployment/apache-vhost.conf.example evita exponer .env o vendor.</w:t>
+              <w:t>El proyecto funciona con Apache y SQLite. El DocumentRoot debe apuntar a la carpeta public; el ejemplo deployment/apache-vhost.conf.example evita exponer .env o vendor.</w:t>
+            </w:r>
+          </w:p>
+        </w:tc>
+      </w:tr>
+    </w:tbl>
+    <w:p>
+      <w:pPr>
+        <w:spacing w:after="0"/>
+      </w:pPr>
+    </w:p>
+    <w:tbl>
+      <w:tblPr>
+        <w:tblStyle w:val="TableGrid"/>
+        <w:tblW w:type="dxa" w:w="9360"/>
+        <w:jc w:val="left"/>
+        <w:tblLayout w:type="fixed"/>
+        <w:tblLook w:firstColumn="1" w:firstRow="1" w:lastColumn="0" w:lastRow="0" w:noHBand="0" w:noVBand="1" w:val="04A0"/>
+        <w:tblInd w:w="120" w:type="dxa"/>
+      </w:tblPr>
+      <w:tblGrid>
+        <w:gridCol w:w="9360"/>
+      </w:tblGrid>
+      <w:tr>
+        <w:trPr>
+          <w:tblHeader w:val="true"/>
+        </w:trPr>
+        <w:tc>
+          <w:tcPr>
+            <w:tcW w:type="dxa" w:w="9360"/>
+            <w:shd w:fill="E7F0E9"/>
+            <w:vAlign w:val="center"/>
+            <w:tcMar>
+              <w:top w:w="80" w:type="dxa"/>
+              <w:start w:w="120" w:type="dxa"/>
+              <w:bottom w:w="80" w:type="dxa"/>
+              <w:end w:w="120" w:type="dxa"/>
+            </w:tcMar>
+          </w:tcPr>
+          <w:p>
+            <w:pPr>
+              <w:spacing w:after="60"/>
+            </w:pPr>
+            <w:r>
+              <w:rPr>
+                <w:rFonts w:ascii="Calibri" w:hAnsi="Calibri"/>
+                <w:b/>
+                <w:color w:val="1F6847"/>
+                <w:sz w:val="21"/>
+              </w:rPr>
+              <w:t>Demostración en Vercel</w:t>
+            </w:r>
+          </w:p>
+          <w:p>
+            <w:pPr>
+              <w:spacing w:after="0"/>
+            </w:pPr>
+            <w:r>
+              <w:t>La instalación académica conserva SQLite. La URL pública usa Neon PostgreSQL porque Vercel no ofrece persistencia para archivos SQLite; deployment/env.vercel.example enumera la configuración sin incluir secretos.</w:t>
             </w:r>
           </w:p>
         </w:tc>
@@ -2323,7 +2333,7 @@
                 <w:color w:val="17251D"/>
                 <w:sz w:val="18"/>
               </w:rPr>
-              <w:t>Versiones fijadas en composer.lock; la auditoría externa requiere acceso autorizado a Packagist.</w:t>
+              <w:t>Versiones fijadas en composer.lock y revisadas con composer audit.</w:t>
             </w:r>
           </w:p>
         </w:tc>
@@ -4706,7 +4716,7 @@
                 <w:color w:val="17251D"/>
                 <w:sz w:val="18"/>
               </w:rPr>
-              <w:t>Fuente, SQL, pruebas y docs.</w:t>
+              <w:t>Fuente, migraciones, pruebas y docs.</w:t>
             </w:r>
           </w:p>
         </w:tc>
@@ -5630,7 +5640,7 @@
               <w:spacing w:after="0"/>
             </w:pPr>
             <w:r>
-              <w:t>No responder al menos el 50 % de las preguntas puede anular hasta el 75 % del valor del proyecto. Cada integrante debe comprender y demostrar su módulo. La asistencia de Codex se declara y se acompaña con adaptación, pruebas, historial Git y documentación; ocultarla no demuestra autoría.</w:t>
+              <w:t>No responder al menos el 50 % de las preguntas puede anular hasta el 75 % del valor del proyecto. Cada integrante debe comprender su módulo, explicar las decisiones y ejecutar el proyecto.</w:t>
             </w:r>
           </w:p>
         </w:tc>
@@ -5652,6 +5662,9 @@
     <w:p>
       <w:pPr>
         <w:pStyle w:val="ListNumber"/>
+        <w:numPr>
+          <w:numId w:val="11"/>
+        </w:numPr>
       </w:pPr>
       <w:r>
         <w:t>Presentar MVC, migraciones y tablas SQLite.</w:t>
@@ -5660,6 +5673,9 @@
     <w:p>
       <w:pPr>
         <w:pStyle w:val="ListNumber"/>
+        <w:numPr>
+          <w:numId w:val="11"/>
+        </w:numPr>
       </w:pPr>
       <w:r>
         <w:t>Filtrar productos y mostrar cookie de recientes.</w:t>
@@ -5668,6 +5684,9 @@
     <w:p>
       <w:pPr>
         <w:pStyle w:val="ListNumber"/>
+        <w:numPr>
+          <w:numId w:val="11"/>
+        </w:numPr>
       </w:pPr>
       <w:r>
         <w:t>Modificar carrito y explicar cálculos.</w:t>
@@ -5676,6 +5695,9 @@
     <w:p>
       <w:pPr>
         <w:pStyle w:val="ListNumber"/>
+        <w:numPr>
+          <w:numId w:val="11"/>
+        </w:numPr>
       </w:pPr>
       <w:r>
         <w:t>Completar compra simulada y descargar factura.</w:t>
@@ -5684,6 +5706,9 @@
     <w:p>
       <w:pPr>
         <w:pStyle w:val="ListNumber"/>
+        <w:numPr>
+          <w:numId w:val="11"/>
+        </w:numPr>
       </w:pPr>
       <w:r>
         <w:t>Mostrar historial, panel y reportes PDF.</w:t>
@@ -5692,6 +5717,9 @@
     <w:p>
       <w:pPr>
         <w:pStyle w:val="ListNumber"/>
+        <w:numPr>
+          <w:numId w:val="11"/>
+        </w:numPr>
       </w:pPr>
       <w:r>
         <w:t>Ejecutar pruebas y mostrar GitHub Actions.</w:t>
@@ -5970,77 +5998,6 @@
         <w:spacing w:after="0"/>
       </w:pPr>
     </w:p>
-    <w:p>
-      <w:pPr>
-        <w:pStyle w:val="Heading2"/>
-      </w:pPr>
-      <w:r>
-        <w:t>Límites externos</w:t>
-      </w:r>
-    </w:p>
-    <w:p>
-      <w:r>
-        <w:t>La asistencia y las respuestas de la exposición son responsabilidad de Byron Chacón y Franklin Castillo. El repositorio privado real es github.com/Byroncha1323/cafe-salas. El hosting y un certificado público requieren cuenta, dominio y autorización del equipo.</w:t>
-      </w:r>
-    </w:p>
-    <w:tbl>
-      <w:tblPr>
-        <w:tblStyle w:val="TableGrid"/>
-        <w:tblW w:type="dxa" w:w="9360"/>
-        <w:jc w:val="left"/>
-        <w:tblLayout w:type="fixed"/>
-        <w:tblLook w:firstColumn="1" w:firstRow="1" w:lastColumn="0" w:lastRow="0" w:noHBand="0" w:noVBand="1" w:val="04A0"/>
-        <w:tblInd w:w="120" w:type="dxa"/>
-      </w:tblPr>
-      <w:tblGrid>
-        <w:gridCol w:w="9360"/>
-      </w:tblGrid>
-      <w:tr>
-        <w:trPr>
-          <w:tblHeader w:val="true"/>
-        </w:trPr>
-        <w:tc>
-          <w:tcPr>
-            <w:tcW w:type="dxa" w:w="9360"/>
-            <w:shd w:fill="E7F0E9"/>
-            <w:vAlign w:val="center"/>
-            <w:tcMar>
-              <w:top w:w="80" w:type="dxa"/>
-              <w:start w:w="120" w:type="dxa"/>
-              <w:bottom w:w="80" w:type="dxa"/>
-              <w:end w:w="120" w:type="dxa"/>
-            </w:tcMar>
-          </w:tcPr>
-          <w:p>
-            <w:pPr>
-              <w:spacing w:after="60"/>
-            </w:pPr>
-            <w:r>
-              <w:rPr>
-                <w:rFonts w:ascii="Calibri" w:hAnsi="Calibri"/>
-                <w:b/>
-                <w:color w:val="1F6847"/>
-                <w:sz w:val="21"/>
-              </w:rPr>
-              <w:t>Uso responsable de herramientas</w:t>
-            </w:r>
-          </w:p>
-          <w:p>
-            <w:pPr>
-              <w:spacing w:after="0"/>
-            </w:pPr>
-            <w:r>
-              <w:t>Para apoyar el desarrollo, revisión y documentación se utilizó OpenAI Codex. Byron Chacón y Franklin Castillo revisaron, adaptaron, probaron y estudiaron el proyecto, y son responsables de comprender y explicar su funcionamiento.</w:t>
-            </w:r>
-          </w:p>
-        </w:tc>
-      </w:tr>
-    </w:tbl>
-    <w:p>
-      <w:pPr>
-        <w:spacing w:after="0"/>
-      </w:pPr>
-    </w:p>
     <w:sectPr>
       <w:headerReference w:type="default" r:id="rId9"/>
       <w:footerReference w:type="default" r:id="rId10"/>
@@ -6296,6 +6253,18 @@
   </w:num>
   <w:num w:numId="9">
     <w:abstractNumId w:val="0"/>
+  </w:num>
+  <w:num w:numId="10">
+    <w:abstractNumId w:val="7"/>
+    <w:lvlOverride w:ilvl="0">
+      <w:startOverride w:val="1"/>
+    </w:lvlOverride>
+  </w:num>
+  <w:num w:numId="11">
+    <w:abstractNumId w:val="7"/>
+    <w:lvlOverride w:ilvl="0">
+      <w:startOverride w:val="1"/>
+    </w:lvlOverride>
   </w:num>
 </w:numbering>
 </file>

</xml_diff>

<commit_message>
Documentar despliegue público de Café Salas
</commit_message>
<xml_diff>
--- a/docs/Documentacion_Cafe_Salas.docx
+++ b/docs/Documentacion_Cafe_Salas.docx
@@ -1001,7 +1001,7 @@
               <w:spacing w:after="0"/>
             </w:pPr>
             <w:r>
-              <w:t>La instalación académica conserva SQLite. La URL pública usa Neon PostgreSQL porque Vercel no ofrece persistencia para archivos SQLite; deployment/env.vercel.example enumera la configuración sin incluir secretos.</w:t>
+              <w:t>La instalación académica conserva SQLite. La demostración pública está disponible en cafe-salas.vercel.app y usa Neon PostgreSQL porque Vercel no ofrece persistencia para archivos SQLite; deployment/env.vercel.example enumera la configuración sin incluir secretos.</w:t>
             </w:r>
           </w:p>
         </w:tc>
@@ -5574,7 +5574,7 @@
                 <w:color w:val="17251D"/>
                 <w:sz w:val="18"/>
               </w:rPr>
-              <w:t>Repositorio privado real: Byroncha1323/cafe-salas.</w:t>
+              <w:t>Repositorio real: frank771-ai/cafe-salas.</w:t>
             </w:r>
           </w:p>
         </w:tc>

</xml_diff>

<commit_message>
Completar documentacion final y comentarios de rubrica
</commit_message>
<xml_diff>
--- a/docs/Documentacion_Cafe_Salas.docx
+++ b/docs/Documentacion_Cafe_Salas.docx
@@ -298,6 +298,8 @@
         </w:rPr>
         <w:t>Universidad Técnica Nacional - Costa Rica</w:t>
       </w:r>
+    </w:p>
+    <w:p>
       <w:r>
         <w:br w:type="page"/>
       </w:r>
@@ -458,7 +460,7 @@
               <w:spacing w:after="0"/>
             </w:pPr>
             <w:r>
-              <w:t>La revisión final aprobó 52 pruebas con 250 aserciones, migraciones y seeders SQLite, 24 rutas, Laravel Pint y la auditoría de dependencias sin avisos conocidos.</w:t>
+              <w:t>La revisión del 23 de agosto de 2026 aprobó 52 pruebas con 250 aserciones, migraciones y seeders SQLite, 24 rutas, Laravel Pint y la auditoría de dependencias sin avisos conocidos.</w:t>
             </w:r>
           </w:p>
         </w:tc>
@@ -1110,6 +1112,64 @@
       <w:r>
         <w:t>Métodos cortos, variables descriptivas y comentarios breves explican la intención sin repetir cada línea.</w:t>
       </w:r>
+    </w:p>
+    <w:tbl>
+      <w:tblPr>
+        <w:tblStyle w:val="TableGrid"/>
+        <w:tblW w:type="dxa" w:w="9360"/>
+        <w:jc w:val="left"/>
+        <w:tblLayout w:type="fixed"/>
+        <w:tblLook w:firstColumn="1" w:firstRow="1" w:lastColumn="0" w:lastRow="0" w:noHBand="0" w:noVBand="1" w:val="04A0"/>
+        <w:tblInd w:w="120" w:type="dxa"/>
+      </w:tblPr>
+      <w:tblGrid>
+        <w:gridCol w:w="9360"/>
+      </w:tblGrid>
+      <w:tr>
+        <w:trPr>
+          <w:tblHeader w:val="true"/>
+        </w:trPr>
+        <w:tc>
+          <w:tcPr>
+            <w:tcW w:type="dxa" w:w="9360"/>
+            <w:shd w:fill="E7F0E9"/>
+            <w:vAlign w:val="center"/>
+            <w:tcMar>
+              <w:top w:w="80" w:type="dxa"/>
+              <w:start w:w="120" w:type="dxa"/>
+              <w:bottom w:w="80" w:type="dxa"/>
+              <w:end w:w="120" w:type="dxa"/>
+            </w:tcMar>
+          </w:tcPr>
+          <w:p>
+            <w:pPr>
+              <w:spacing w:after="60"/>
+            </w:pPr>
+            <w:r>
+              <w:rPr>
+                <w:rFonts w:ascii="Calibri" w:hAnsi="Calibri"/>
+                <w:b/>
+                <w:color w:val="1F6847"/>
+                <w:sz w:val="21"/>
+              </w:rPr>
+              <w:t>Funciones documentadas</w:t>
+            </w:r>
+          </w:p>
+          <w:p>
+            <w:pPr>
+              <w:spacing w:after="0"/>
+            </w:pPr>
+            <w:r>
+              <w:t>Los comentarios naturales se concentran en las reglas centrales de la rúbrica: carrito y totales, cookie de recientes, checkout transaccional, protección del inventario, pago simulado, estados de pedido, facturas y reportes PDF.</w:t>
+            </w:r>
+          </w:p>
+        </w:tc>
+      </w:tr>
+    </w:tbl>
+    <w:p>
+      <w:pPr>
+        <w:spacing w:after="0"/>
+      </w:pPr>
     </w:p>
     <w:p>
       <w:pPr>

</xml_diff>